<commit_message>
Fix a term my own residual check could not see, and fix the check
"当前位姿" survived in the specification's problem four because the source wraps
it as 自当前 / 位姿, so a line-oriented grep found nothing while Word rendered
it as one word. The check now strips whitespace before matching, and it
immediately turned up two more real leftovers the old method had missed.

The larger one: the README still carried the withdrawn figure-3 rule -- draw
the shells offset along the whole patch, never as circles about the centroid --
which is the opposite of what the code does and of what the figure and the
figure spec now say. That file is the first thing a recipient opens. Rewritten,
and the two other easily-mis-drawn figures added alongside it.

Co-Authored-By: Claude Opus 5 <noreply@anthropic.com>
</commit_message>
<xml_diff>
--- a/交付_20260809_补充扫描规划专利/03_内部材料/最终交付检查表.docx
+++ b/交付_20260809_补充扫描规划专利/03_内部材料/最终交付检查表.docx
@@ -3087,7 +3087,7 @@
                 <w:rFonts w:ascii="SimSun" w:hAnsi="SimSun" w:eastAsia="SimSun"/>
                 <w:sz w:val="17"/>
               </w:rPr>
-              <w:t>当前位姿／可通行空间／可通行路径代价／候选补充扫描站位</w:t>
+              <w:t>当前位置／可通行空间／可通行路径代价／候选补充扫描站位</w:t>
             </w:r>
           </w:p>
         </w:tc>
@@ -5832,7 +5832,22 @@
                 <w:rFonts w:ascii="SimSun" w:hAnsi="SimSun" w:eastAsia="SimSun"/>
                 <w:sz w:val="17"/>
               </w:rPr>
-              <w:t>。权项、说明书、符号表、图 5 均已统一，"当前位姿"仅存于修改说明表</w:t>
+              <w:t>。权项、说明书、符号表、图 5、README 与 E 均已统一，"当前位姿"仅存于各文件的修改说明表。</w:t>
+            </w:r>
+            <w:r>
+              <w:rPr>
+                <w:rFonts w:ascii="SimSun" w:hAnsi="SimSun" w:eastAsia="SimSun"/>
+                <w:b/>
+                <w:sz w:val="17"/>
+              </w:rPr>
+              <w:t>复检方式已改为"去掉换行后匹配"</w:t>
+            </w:r>
+            <w:r>
+              <w:rPr>
+                <w:rFonts w:ascii="SimSun" w:hAnsi="SimSun" w:eastAsia="SimSun"/>
+                <w:sz w:val="17"/>
+              </w:rPr>
+              <w:t>——此前逐行 grep 会漏掉被软换行拆开的词（说明书问题四中的"自当前／位姿"即因此漏检一轮）</w:t>
             </w:r>
           </w:p>
         </w:tc>

</xml_diff>